<commit_message>
Update SCW prep docs and publish 2026 plan
</commit_message>
<xml_diff>
--- a/docs/JMWG-Meeting report-01-2026v2.docx
+++ b/docs/JMWG-Meeting report-01-2026v2.docx
@@ -7,7 +7,7 @@
         <w:pStyle w:val="Title"/>
       </w:pPr>
       <w:r>
-        <w:t xml:space="preserve">JMWG MSE Task Team Meeting 01/2026</w:t>
+        <w:t xml:space="preserve">JMWG Meeting 01/2026</w:t>
       </w:r>
     </w:p>
     <w:sdt>
@@ -147,7 +147,7 @@
         <w:pStyle w:val="BodyText"/>
       </w:pPr>
       <w:r>
-        <w:t xml:space="preserve">01 April 2026</w:t>
+        <w:t xml:space="preserve">04 April 2026</w:t>
       </w:r>
     </w:p>
     <w:bookmarkStart w:id="23" w:name="summary"/>

</xml_diff>